<commit_message>
docx: two-column IEEE layout, title spans full width
</commit_message>
<xml_diff>
--- a/paper/icdm/icdm.docx
+++ b/paper/icdm/icdm.docx
@@ -25,6 +25,16 @@
         <w:br/>
         <w:t>St. Mark's School</w:t>
       </w:r>
+    </w:p>
+    <w:p>
+      <w:pPr>
+        <w:sectPr>
+          <w:pgSz w:w="12240" w:h="15840"/>
+          <w:pgMar w:top="1080" w:right="900" w:bottom="1440" w:left="900" w:header="720" w:footer="720" w:gutter="0"/>
+          <w:cols w:space="720"/>
+          <w:docGrid w:linePitch="360"/>
+        </w:sectPr>
+      </w:pPr>
     </w:p>
     <w:p>
       <w:pPr>
@@ -495,9 +505,10 @@
       </w:r>
     </w:p>
     <w:sectPr>
+      <w:type w:val="continuous"/>
       <w:pgSz w:w="12240" w:h="15840"/>
       <w:pgMar w:top="1080" w:right="900" w:bottom="1440" w:left="900" w:header="720" w:footer="720" w:gutter="0"/>
-      <w:cols w:space="720"/>
+      <w:cols w:space="288" w:num="2"/>
       <w:docGrid w:linePitch="360"/>
     </w:sectPr>
   </w:body>

</xml_diff>

<commit_message>
docx: indent paragraphs and space the headings, matches IEEE better
</commit_message>
<xml_diff>
--- a/paper/icdm/icdm.docx
+++ b/paper/icdm/icdm.docx
@@ -74,6 +74,7 @@
     </w:p>
     <w:p>
       <w:pPr>
+        <w:spacing w:before="120" w:after="60"/>
         <w:jc w:val="center"/>
       </w:pPr>
       <w:r>
@@ -87,6 +88,7 @@
     <w:p>
       <w:pPr>
         <w:spacing w:after="0"/>
+        <w:ind w:firstLine="288"/>
         <w:jc w:val="both"/>
       </w:pPr>
       <w:r>
@@ -99,6 +101,7 @@
     <w:p>
       <w:pPr>
         <w:spacing w:after="0"/>
+        <w:ind w:firstLine="288"/>
         <w:jc w:val="both"/>
       </w:pPr>
       <w:r>
@@ -111,6 +114,7 @@
     <w:p>
       <w:pPr>
         <w:spacing w:after="0"/>
+        <w:ind w:firstLine="288"/>
         <w:jc w:val="both"/>
       </w:pPr>
       <w:r>
@@ -122,6 +126,7 @@
     </w:p>
     <w:p>
       <w:pPr>
+        <w:spacing w:before="120" w:after="60"/>
         <w:jc w:val="center"/>
       </w:pPr>
       <w:r>
@@ -135,6 +140,7 @@
     <w:p>
       <w:pPr>
         <w:spacing w:after="0"/>
+        <w:ind w:firstLine="288"/>
         <w:jc w:val="both"/>
       </w:pPr>
       <w:r>
@@ -147,6 +153,7 @@
     <w:p>
       <w:pPr>
         <w:spacing w:after="0"/>
+        <w:ind w:firstLine="288"/>
         <w:jc w:val="both"/>
       </w:pPr>
       <w:r>
@@ -159,6 +166,7 @@
     <w:p>
       <w:pPr>
         <w:spacing w:after="0"/>
+        <w:ind w:firstLine="288"/>
         <w:jc w:val="both"/>
       </w:pPr>
       <w:r>
@@ -170,6 +178,7 @@
     </w:p>
     <w:p>
       <w:pPr>
+        <w:spacing w:before="120" w:after="60"/>
         <w:jc w:val="center"/>
       </w:pPr>
       <w:r>
@@ -183,6 +192,7 @@
     <w:p>
       <w:pPr>
         <w:spacing w:after="0"/>
+        <w:ind w:firstLine="288"/>
         <w:jc w:val="both"/>
       </w:pPr>
       <w:r>
@@ -195,6 +205,7 @@
     <w:p>
       <w:pPr>
         <w:spacing w:after="0"/>
+        <w:ind w:firstLine="288"/>
         <w:jc w:val="both"/>
       </w:pPr>
       <w:r>
@@ -206,6 +217,7 @@
     </w:p>
     <w:p>
       <w:pPr>
+        <w:spacing w:before="120" w:after="60"/>
         <w:jc w:val="center"/>
       </w:pPr>
       <w:r>
@@ -219,6 +231,7 @@
     <w:p>
       <w:pPr>
         <w:spacing w:after="0"/>
+        <w:ind w:firstLine="288"/>
         <w:jc w:val="both"/>
       </w:pPr>
       <w:r>
@@ -231,6 +244,7 @@
     <w:p>
       <w:pPr>
         <w:spacing w:after="0"/>
+        <w:ind w:firstLine="288"/>
         <w:jc w:val="both"/>
       </w:pPr>
       <w:r>
@@ -243,6 +257,7 @@
     <w:p>
       <w:pPr>
         <w:spacing w:after="0"/>
+        <w:ind w:firstLine="288"/>
         <w:jc w:val="both"/>
       </w:pPr>
       <w:r>
@@ -255,6 +270,7 @@
     <w:p>
       <w:pPr>
         <w:spacing w:after="0"/>
+        <w:ind w:firstLine="288"/>
         <w:jc w:val="both"/>
       </w:pPr>
       <w:r>
@@ -266,6 +282,7 @@
     </w:p>
     <w:p>
       <w:pPr>
+        <w:spacing w:before="120" w:after="60"/>
         <w:jc w:val="center"/>
       </w:pPr>
       <w:r>
@@ -279,6 +296,7 @@
     <w:p>
       <w:pPr>
         <w:spacing w:after="0"/>
+        <w:ind w:firstLine="288"/>
         <w:jc w:val="both"/>
       </w:pPr>
       <w:r>
@@ -291,6 +309,7 @@
     <w:p>
       <w:pPr>
         <w:spacing w:after="0"/>
+        <w:ind w:firstLine="288"/>
         <w:jc w:val="both"/>
       </w:pPr>
       <w:r>
@@ -303,6 +322,7 @@
     <w:p>
       <w:pPr>
         <w:spacing w:after="0"/>
+        <w:ind w:firstLine="288"/>
         <w:jc w:val="both"/>
       </w:pPr>
       <w:r>
@@ -315,6 +335,7 @@
     <w:p>
       <w:pPr>
         <w:spacing w:after="0"/>
+        <w:ind w:firstLine="288"/>
         <w:jc w:val="both"/>
       </w:pPr>
       <w:r>
@@ -327,6 +348,7 @@
     <w:p>
       <w:pPr>
         <w:spacing w:after="0"/>
+        <w:ind w:firstLine="288"/>
         <w:jc w:val="both"/>
       </w:pPr>
       <w:r>
@@ -338,6 +360,7 @@
     </w:p>
     <w:p>
       <w:pPr>
+        <w:spacing w:before="120" w:after="60"/>
         <w:jc w:val="center"/>
       </w:pPr>
       <w:r>
@@ -351,6 +374,7 @@
     <w:p>
       <w:pPr>
         <w:spacing w:after="0"/>
+        <w:ind w:firstLine="288"/>
         <w:jc w:val="both"/>
       </w:pPr>
       <w:r>
@@ -363,6 +387,7 @@
     <w:p>
       <w:pPr>
         <w:spacing w:after="0"/>
+        <w:ind w:firstLine="288"/>
         <w:jc w:val="both"/>
       </w:pPr>
       <w:r>
@@ -374,6 +399,7 @@
     </w:p>
     <w:p>
       <w:pPr>
+        <w:spacing w:before="120" w:after="60"/>
         <w:jc w:val="center"/>
       </w:pPr>
       <w:r>
@@ -387,6 +413,7 @@
     <w:p>
       <w:pPr>
         <w:spacing w:after="0"/>
+        <w:ind w:firstLine="288"/>
         <w:jc w:val="both"/>
       </w:pPr>
       <w:r>

</xml_diff>

<commit_message>
docx: use a colon on the abstract lead-in instead of a dash
</commit_message>
<xml_diff>
--- a/paper/icdm/icdm.docx
+++ b/paper/icdm/icdm.docx
@@ -46,7 +46,7 @@
           <w:i/>
           <w:sz w:val="18"/>
         </w:rPr>
-        <w:t>Abstract—</w:t>
+        <w:t xml:space="preserve">Abstract: </w:t>
       </w:r>
       <w:r>
         <w:rPr>
@@ -63,7 +63,7 @@
           <w:i/>
           <w:sz w:val="18"/>
         </w:rPr>
-        <w:t>Index Terms—</w:t>
+        <w:t xml:space="preserve">Index Terms: </w:t>
       </w:r>
       <w:r>
         <w:rPr>

</xml_diff>

<commit_message>
docx: render the ranking table too, fixed grid so rank column holds
</commit_message>
<xml_diff>
--- a/paper/icdm/icdm.docx
+++ b/paper/icdm/icdm.docx
@@ -295,6 +295,1032 @@
     </w:p>
     <w:p>
       <w:pPr>
+        <w:jc w:val="center"/>
+      </w:pPr>
+      <w:r>
+        <w:rPr>
+          <w:b/>
+          <w:sz w:val="16"/>
+        </w:rPr>
+        <w:t>TABLE I</w:t>
+      </w:r>
+    </w:p>
+    <w:p>
+      <w:pPr>
+        <w:jc w:val="center"/>
+      </w:pPr>
+      <w:r>
+        <w:rPr>
+          <w:i/>
+          <w:sz w:val="16"/>
+        </w:rPr>
+        <w:t>The 23 simulants ranked by screening score (0 = friendliest to plants, 1 = riskiest).</w:t>
+      </w:r>
+    </w:p>
+    <w:tbl>
+      <w:tblPr>
+        <w:tblStyle w:val="TableGrid"/>
+        <w:tblW w:type="auto" w:w="0"/>
+        <w:jc w:val="center"/>
+        <w:tblLayout w:type="fixed"/>
+        <w:tblLook w:firstColumn="1" w:firstRow="1" w:lastColumn="0" w:lastRow="0" w:noHBand="0" w:noVBand="1" w:val="04A0"/>
+        <w:tblLayout w:type="fixed"/>
+      </w:tblPr>
+      <w:tblGrid>
+        <w:gridCol w:w="720"/>
+        <w:gridCol w:w="2016"/>
+        <w:gridCol w:w="864"/>
+      </w:tblGrid>
+      <w:tr>
+        <w:tc>
+          <w:tcPr>
+            <w:tcW w:type="dxa" w:w="720"/>
+          </w:tcPr>
+          <w:p>
+            <w:r>
+              <w:rPr>
+                <w:b/>
+                <w:sz w:val="16"/>
+              </w:rPr>
+              <w:t>Rank</w:t>
+            </w:r>
+          </w:p>
+        </w:tc>
+        <w:tc>
+          <w:tcPr>
+            <w:tcW w:type="dxa" w:w="2016"/>
+          </w:tcPr>
+          <w:p>
+            <w:r>
+              <w:rPr>
+                <w:b/>
+                <w:sz w:val="16"/>
+              </w:rPr>
+              <w:t>Simulant</w:t>
+            </w:r>
+          </w:p>
+        </w:tc>
+        <w:tc>
+          <w:tcPr>
+            <w:tcW w:type="dxa" w:w="864"/>
+          </w:tcPr>
+          <w:p>
+            <w:r>
+              <w:rPr>
+                <w:b/>
+                <w:sz w:val="16"/>
+              </w:rPr>
+              <w:t>Score</w:t>
+            </w:r>
+          </w:p>
+        </w:tc>
+      </w:tr>
+      <w:tr>
+        <w:tc>
+          <w:tcPr>
+            <w:tcW w:type="dxa" w:w="720"/>
+          </w:tcPr>
+          <w:p>
+            <w:r>
+              <w:rPr>
+                <w:sz w:val="16"/>
+              </w:rPr>
+              <w:t>1</w:t>
+            </w:r>
+          </w:p>
+        </w:tc>
+        <w:tc>
+          <w:tcPr>
+            <w:tcW w:type="dxa" w:w="2016"/>
+          </w:tcPr>
+          <w:p>
+            <w:r>
+              <w:rPr>
+                <w:sz w:val="16"/>
+              </w:rPr>
+              <w:t>LSS-ISAC-1</w:t>
+            </w:r>
+          </w:p>
+        </w:tc>
+        <w:tc>
+          <w:tcPr>
+            <w:tcW w:type="dxa" w:w="864"/>
+          </w:tcPr>
+          <w:p>
+            <w:r>
+              <w:rPr>
+                <w:sz w:val="16"/>
+              </w:rPr>
+              <w:t>0.00</w:t>
+            </w:r>
+          </w:p>
+        </w:tc>
+      </w:tr>
+      <w:tr>
+        <w:tc>
+          <w:tcPr>
+            <w:tcW w:type="dxa" w:w="720"/>
+          </w:tcPr>
+          <w:p>
+            <w:r>
+              <w:rPr>
+                <w:sz w:val="16"/>
+              </w:rPr>
+              <w:t>2</w:t>
+            </w:r>
+          </w:p>
+        </w:tc>
+        <w:tc>
+          <w:tcPr>
+            <w:tcW w:type="dxa" w:w="2016"/>
+          </w:tcPr>
+          <w:p>
+            <w:r>
+              <w:rPr>
+                <w:sz w:val="16"/>
+              </w:rPr>
+              <w:t>EAC-1A</w:t>
+            </w:r>
+          </w:p>
+        </w:tc>
+        <w:tc>
+          <w:tcPr>
+            <w:tcW w:type="dxa" w:w="864"/>
+          </w:tcPr>
+          <w:p>
+            <w:r>
+              <w:rPr>
+                <w:sz w:val="16"/>
+              </w:rPr>
+              <w:t>0.00</w:t>
+            </w:r>
+          </w:p>
+        </w:tc>
+      </w:tr>
+      <w:tr>
+        <w:tc>
+          <w:tcPr>
+            <w:tcW w:type="dxa" w:w="720"/>
+          </w:tcPr>
+          <w:p>
+            <w:r>
+              <w:rPr>
+                <w:sz w:val="16"/>
+              </w:rPr>
+              <w:t>3</w:t>
+            </w:r>
+          </w:p>
+        </w:tc>
+        <w:tc>
+          <w:tcPr>
+            <w:tcW w:type="dxa" w:w="2016"/>
+          </w:tcPr>
+          <w:p>
+            <w:r>
+              <w:rPr>
+                <w:sz w:val="16"/>
+              </w:rPr>
+              <w:t>MLS-1</w:t>
+            </w:r>
+          </w:p>
+        </w:tc>
+        <w:tc>
+          <w:tcPr>
+            <w:tcW w:type="dxa" w:w="864"/>
+          </w:tcPr>
+          <w:p>
+            <w:r>
+              <w:rPr>
+                <w:sz w:val="16"/>
+              </w:rPr>
+              <w:t>0.02</w:t>
+            </w:r>
+          </w:p>
+        </w:tc>
+      </w:tr>
+      <w:tr>
+        <w:tc>
+          <w:tcPr>
+            <w:tcW w:type="dxa" w:w="720"/>
+          </w:tcPr>
+          <w:p>
+            <w:r>
+              <w:rPr>
+                <w:sz w:val="16"/>
+              </w:rPr>
+              <w:t>4</w:t>
+            </w:r>
+          </w:p>
+        </w:tc>
+        <w:tc>
+          <w:tcPr>
+            <w:tcW w:type="dxa" w:w="2016"/>
+          </w:tcPr>
+          <w:p>
+            <w:r>
+              <w:rPr>
+                <w:sz w:val="16"/>
+              </w:rPr>
+              <w:t>CAS-1</w:t>
+            </w:r>
+          </w:p>
+        </w:tc>
+        <w:tc>
+          <w:tcPr>
+            <w:tcW w:type="dxa" w:w="864"/>
+          </w:tcPr>
+          <w:p>
+            <w:r>
+              <w:rPr>
+                <w:sz w:val="16"/>
+              </w:rPr>
+              <w:t>0.04</w:t>
+            </w:r>
+          </w:p>
+        </w:tc>
+      </w:tr>
+      <w:tr>
+        <w:tc>
+          <w:tcPr>
+            <w:tcW w:type="dxa" w:w="720"/>
+          </w:tcPr>
+          <w:p>
+            <w:r>
+              <w:rPr>
+                <w:sz w:val="16"/>
+              </w:rPr>
+              <w:t>5</w:t>
+            </w:r>
+          </w:p>
+        </w:tc>
+        <w:tc>
+          <w:tcPr>
+            <w:tcW w:type="dxa" w:w="2016"/>
+          </w:tcPr>
+          <w:p>
+            <w:r>
+              <w:rPr>
+                <w:sz w:val="16"/>
+              </w:rPr>
+              <w:t>JSC-1</w:t>
+            </w:r>
+          </w:p>
+        </w:tc>
+        <w:tc>
+          <w:tcPr>
+            <w:tcW w:type="dxa" w:w="864"/>
+          </w:tcPr>
+          <w:p>
+            <w:r>
+              <w:rPr>
+                <w:sz w:val="16"/>
+              </w:rPr>
+              <w:t>0.04</w:t>
+            </w:r>
+          </w:p>
+        </w:tc>
+      </w:tr>
+      <w:tr>
+        <w:tc>
+          <w:tcPr>
+            <w:tcW w:type="dxa" w:w="720"/>
+          </w:tcPr>
+          <w:p>
+            <w:r>
+              <w:rPr>
+                <w:sz w:val="16"/>
+              </w:rPr>
+              <w:t>6</w:t>
+            </w:r>
+          </w:p>
+        </w:tc>
+        <w:tc>
+          <w:tcPr>
+            <w:tcW w:type="dxa" w:w="2016"/>
+          </w:tcPr>
+          <w:p>
+            <w:r>
+              <w:rPr>
+                <w:sz w:val="16"/>
+              </w:rPr>
+              <w:t>BP-1</w:t>
+            </w:r>
+          </w:p>
+        </w:tc>
+        <w:tc>
+          <w:tcPr>
+            <w:tcW w:type="dxa" w:w="864"/>
+          </w:tcPr>
+          <w:p>
+            <w:r>
+              <w:rPr>
+                <w:sz w:val="16"/>
+              </w:rPr>
+              <w:t>0.04</w:t>
+            </w:r>
+          </w:p>
+        </w:tc>
+      </w:tr>
+      <w:tr>
+        <w:tc>
+          <w:tcPr>
+            <w:tcW w:type="dxa" w:w="720"/>
+          </w:tcPr>
+          <w:p>
+            <w:r>
+              <w:rPr>
+                <w:sz w:val="16"/>
+              </w:rPr>
+              <w:t>7</w:t>
+            </w:r>
+          </w:p>
+        </w:tc>
+        <w:tc>
+          <w:tcPr>
+            <w:tcW w:type="dxa" w:w="2016"/>
+          </w:tcPr>
+          <w:p>
+            <w:r>
+              <w:rPr>
+                <w:sz w:val="16"/>
+              </w:rPr>
+              <w:t>LHS-1</w:t>
+            </w:r>
+          </w:p>
+        </w:tc>
+        <w:tc>
+          <w:tcPr>
+            <w:tcW w:type="dxa" w:w="864"/>
+          </w:tcPr>
+          <w:p>
+            <w:r>
+              <w:rPr>
+                <w:sz w:val="16"/>
+              </w:rPr>
+              <w:t>0.07</w:t>
+            </w:r>
+          </w:p>
+        </w:tc>
+      </w:tr>
+      <w:tr>
+        <w:tc>
+          <w:tcPr>
+            <w:tcW w:type="dxa" w:w="720"/>
+          </w:tcPr>
+          <w:p>
+            <w:r>
+              <w:rPr>
+                <w:sz w:val="16"/>
+              </w:rPr>
+              <w:t>8</w:t>
+            </w:r>
+          </w:p>
+        </w:tc>
+        <w:tc>
+          <w:tcPr>
+            <w:tcW w:type="dxa" w:w="2016"/>
+          </w:tcPr>
+          <w:p>
+            <w:r>
+              <w:rPr>
+                <w:sz w:val="16"/>
+              </w:rPr>
+              <w:t>KLS-1</w:t>
+            </w:r>
+          </w:p>
+        </w:tc>
+        <w:tc>
+          <w:tcPr>
+            <w:tcW w:type="dxa" w:w="864"/>
+          </w:tcPr>
+          <w:p>
+            <w:r>
+              <w:rPr>
+                <w:sz w:val="16"/>
+              </w:rPr>
+              <w:t>0.08</w:t>
+            </w:r>
+          </w:p>
+        </w:tc>
+      </w:tr>
+      <w:tr>
+        <w:tc>
+          <w:tcPr>
+            <w:tcW w:type="dxa" w:w="720"/>
+          </w:tcPr>
+          <w:p>
+            <w:r>
+              <w:rPr>
+                <w:sz w:val="16"/>
+              </w:rPr>
+              <w:t>9</w:t>
+            </w:r>
+          </w:p>
+        </w:tc>
+        <w:tc>
+          <w:tcPr>
+            <w:tcW w:type="dxa" w:w="2016"/>
+          </w:tcPr>
+          <w:p>
+            <w:r>
+              <w:rPr>
+                <w:sz w:val="16"/>
+              </w:rPr>
+              <w:t>LMS-1</w:t>
+            </w:r>
+          </w:p>
+        </w:tc>
+        <w:tc>
+          <w:tcPr>
+            <w:tcW w:type="dxa" w:w="864"/>
+          </w:tcPr>
+          <w:p>
+            <w:r>
+              <w:rPr>
+                <w:sz w:val="16"/>
+              </w:rPr>
+              <w:t>0.19</w:t>
+            </w:r>
+          </w:p>
+        </w:tc>
+      </w:tr>
+      <w:tr>
+        <w:tc>
+          <w:tcPr>
+            <w:tcW w:type="dxa" w:w="720"/>
+          </w:tcPr>
+          <w:p>
+            <w:r>
+              <w:rPr>
+                <w:sz w:val="16"/>
+              </w:rPr>
+              <w:t>10</w:t>
+            </w:r>
+          </w:p>
+        </w:tc>
+        <w:tc>
+          <w:tcPr>
+            <w:tcW w:type="dxa" w:w="2016"/>
+          </w:tcPr>
+          <w:p>
+            <w:r>
+              <w:rPr>
+                <w:sz w:val="16"/>
+              </w:rPr>
+              <w:t>TLS-01</w:t>
+            </w:r>
+          </w:p>
+        </w:tc>
+        <w:tc>
+          <w:tcPr>
+            <w:tcW w:type="dxa" w:w="864"/>
+          </w:tcPr>
+          <w:p>
+            <w:r>
+              <w:rPr>
+                <w:sz w:val="16"/>
+              </w:rPr>
+              <w:t>0.25</w:t>
+            </w:r>
+          </w:p>
+        </w:tc>
+      </w:tr>
+      <w:tr>
+        <w:tc>
+          <w:tcPr>
+            <w:tcW w:type="dxa" w:w="720"/>
+          </w:tcPr>
+          <w:p>
+            <w:r>
+              <w:rPr>
+                <w:sz w:val="16"/>
+              </w:rPr>
+              <w:t>11</w:t>
+            </w:r>
+          </w:p>
+        </w:tc>
+        <w:tc>
+          <w:tcPr>
+            <w:tcW w:type="dxa" w:w="2016"/>
+          </w:tcPr>
+          <w:p>
+            <w:r>
+              <w:rPr>
+                <w:sz w:val="16"/>
+              </w:rPr>
+              <w:t>CUG-1A</w:t>
+            </w:r>
+          </w:p>
+        </w:tc>
+        <w:tc>
+          <w:tcPr>
+            <w:tcW w:type="dxa" w:w="864"/>
+          </w:tcPr>
+          <w:p>
+            <w:r>
+              <w:rPr>
+                <w:sz w:val="16"/>
+              </w:rPr>
+              <w:t>0.25</w:t>
+            </w:r>
+          </w:p>
+        </w:tc>
+      </w:tr>
+      <w:tr>
+        <w:tc>
+          <w:tcPr>
+            <w:tcW w:type="dxa" w:w="720"/>
+          </w:tcPr>
+          <w:p>
+            <w:r>
+              <w:rPr>
+                <w:sz w:val="16"/>
+              </w:rPr>
+              <w:t>12</w:t>
+            </w:r>
+          </w:p>
+        </w:tc>
+        <w:tc>
+          <w:tcPr>
+            <w:tcW w:type="dxa" w:w="2016"/>
+          </w:tcPr>
+          <w:p>
+            <w:r>
+              <w:rPr>
+                <w:sz w:val="16"/>
+              </w:rPr>
+              <w:t>OPRL2N</w:t>
+            </w:r>
+          </w:p>
+        </w:tc>
+        <w:tc>
+          <w:tcPr>
+            <w:tcW w:type="dxa" w:w="864"/>
+          </w:tcPr>
+          <w:p>
+            <w:r>
+              <w:rPr>
+                <w:sz w:val="16"/>
+              </w:rPr>
+              <w:t>0.36</w:t>
+            </w:r>
+          </w:p>
+        </w:tc>
+      </w:tr>
+      <w:tr>
+        <w:tc>
+          <w:tcPr>
+            <w:tcW w:type="dxa" w:w="720"/>
+          </w:tcPr>
+          <w:p>
+            <w:r>
+              <w:rPr>
+                <w:sz w:val="16"/>
+              </w:rPr>
+              <w:t>13</w:t>
+            </w:r>
+          </w:p>
+        </w:tc>
+        <w:tc>
+          <w:tcPr>
+            <w:tcW w:type="dxa" w:w="2016"/>
+          </w:tcPr>
+          <w:p>
+            <w:r>
+              <w:rPr>
+                <w:sz w:val="16"/>
+              </w:rPr>
+              <w:t>NU-LHT-4M</w:t>
+            </w:r>
+          </w:p>
+        </w:tc>
+        <w:tc>
+          <w:tcPr>
+            <w:tcW w:type="dxa" w:w="864"/>
+          </w:tcPr>
+          <w:p>
+            <w:r>
+              <w:rPr>
+                <w:sz w:val="16"/>
+              </w:rPr>
+              <w:t>0.42</w:t>
+            </w:r>
+          </w:p>
+        </w:tc>
+      </w:tr>
+      <w:tr>
+        <w:tc>
+          <w:tcPr>
+            <w:tcW w:type="dxa" w:w="720"/>
+          </w:tcPr>
+          <w:p>
+            <w:r>
+              <w:rPr>
+                <w:sz w:val="16"/>
+              </w:rPr>
+              <w:t>14</w:t>
+            </w:r>
+          </w:p>
+        </w:tc>
+        <w:tc>
+          <w:tcPr>
+            <w:tcW w:type="dxa" w:w="2016"/>
+          </w:tcPr>
+          <w:p>
+            <w:r>
+              <w:rPr>
+                <w:sz w:val="16"/>
+              </w:rPr>
+              <w:t>FJS-1</w:t>
+            </w:r>
+          </w:p>
+        </w:tc>
+        <w:tc>
+          <w:tcPr>
+            <w:tcW w:type="dxa" w:w="864"/>
+          </w:tcPr>
+          <w:p>
+            <w:r>
+              <w:rPr>
+                <w:sz w:val="16"/>
+              </w:rPr>
+              <w:t>0.42</w:t>
+            </w:r>
+          </w:p>
+        </w:tc>
+      </w:tr>
+      <w:tr>
+        <w:tc>
+          <w:tcPr>
+            <w:tcW w:type="dxa" w:w="720"/>
+          </w:tcPr>
+          <w:p>
+            <w:r>
+              <w:rPr>
+                <w:sz w:val="16"/>
+              </w:rPr>
+              <w:t>15</w:t>
+            </w:r>
+          </w:p>
+        </w:tc>
+        <w:tc>
+          <w:tcPr>
+            <w:tcW w:type="dxa" w:w="2016"/>
+          </w:tcPr>
+          <w:p>
+            <w:r>
+              <w:rPr>
+                <w:sz w:val="16"/>
+              </w:rPr>
+              <w:t>WHU-1</w:t>
+            </w:r>
+          </w:p>
+        </w:tc>
+        <w:tc>
+          <w:tcPr>
+            <w:tcW w:type="dxa" w:w="864"/>
+          </w:tcPr>
+          <w:p>
+            <w:r>
+              <w:rPr>
+                <w:sz w:val="16"/>
+              </w:rPr>
+              <w:t>0.52</w:t>
+            </w:r>
+          </w:p>
+        </w:tc>
+      </w:tr>
+      <w:tr>
+        <w:tc>
+          <w:tcPr>
+            <w:tcW w:type="dxa" w:w="720"/>
+          </w:tcPr>
+          <w:p>
+            <w:r>
+              <w:rPr>
+                <w:sz w:val="16"/>
+              </w:rPr>
+              <w:t>16</w:t>
+            </w:r>
+          </w:p>
+        </w:tc>
+        <w:tc>
+          <w:tcPr>
+            <w:tcW w:type="dxa" w:w="2016"/>
+          </w:tcPr>
+          <w:p>
+            <w:r>
+              <w:rPr>
+                <w:sz w:val="16"/>
+              </w:rPr>
+              <w:t>CSM-LHT-1</w:t>
+            </w:r>
+          </w:p>
+        </w:tc>
+        <w:tc>
+          <w:tcPr>
+            <w:tcW w:type="dxa" w:w="864"/>
+          </w:tcPr>
+          <w:p>
+            <w:r>
+              <w:rPr>
+                <w:sz w:val="16"/>
+              </w:rPr>
+              <w:t>0.63</w:t>
+            </w:r>
+          </w:p>
+        </w:tc>
+      </w:tr>
+      <w:tr>
+        <w:tc>
+          <w:tcPr>
+            <w:tcW w:type="dxa" w:w="720"/>
+          </w:tcPr>
+          <w:p>
+            <w:r>
+              <w:rPr>
+                <w:sz w:val="16"/>
+              </w:rPr>
+              <w:t>17</w:t>
+            </w:r>
+          </w:p>
+        </w:tc>
+        <w:tc>
+          <w:tcPr>
+            <w:tcW w:type="dxa" w:w="2016"/>
+          </w:tcPr>
+          <w:p>
+            <w:r>
+              <w:rPr>
+                <w:sz w:val="16"/>
+              </w:rPr>
+              <w:t>CSM-LMT-1</w:t>
+            </w:r>
+          </w:p>
+        </w:tc>
+        <w:tc>
+          <w:tcPr>
+            <w:tcW w:type="dxa" w:w="864"/>
+          </w:tcPr>
+          <w:p>
+            <w:r>
+              <w:rPr>
+                <w:sz w:val="16"/>
+              </w:rPr>
+              <w:t>0.63</w:t>
+            </w:r>
+          </w:p>
+        </w:tc>
+      </w:tr>
+      <w:tr>
+        <w:tc>
+          <w:tcPr>
+            <w:tcW w:type="dxa" w:w="720"/>
+          </w:tcPr>
+          <w:p>
+            <w:r>
+              <w:rPr>
+                <w:sz w:val="16"/>
+              </w:rPr>
+              <w:t>18</w:t>
+            </w:r>
+          </w:p>
+        </w:tc>
+        <w:tc>
+          <w:tcPr>
+            <w:tcW w:type="dxa" w:w="2016"/>
+          </w:tcPr>
+          <w:p>
+            <w:r>
+              <w:rPr>
+                <w:sz w:val="16"/>
+              </w:rPr>
+              <w:t>OPRH3N</w:t>
+            </w:r>
+          </w:p>
+        </w:tc>
+        <w:tc>
+          <w:tcPr>
+            <w:tcW w:type="dxa" w:w="864"/>
+          </w:tcPr>
+          <w:p>
+            <w:r>
+              <w:rPr>
+                <w:sz w:val="16"/>
+              </w:rPr>
+              <w:t>0.63</w:t>
+            </w:r>
+          </w:p>
+        </w:tc>
+      </w:tr>
+      <w:tr>
+        <w:tc>
+          <w:tcPr>
+            <w:tcW w:type="dxa" w:w="720"/>
+          </w:tcPr>
+          <w:p>
+            <w:r>
+              <w:rPr>
+                <w:sz w:val="16"/>
+              </w:rPr>
+              <w:t>19</w:t>
+            </w:r>
+          </w:p>
+        </w:tc>
+        <w:tc>
+          <w:tcPr>
+            <w:tcW w:type="dxa" w:w="2016"/>
+          </w:tcPr>
+          <w:p>
+            <w:r>
+              <w:rPr>
+                <w:sz w:val="16"/>
+              </w:rPr>
+              <w:t>JSC-1A</w:t>
+            </w:r>
+          </w:p>
+        </w:tc>
+        <w:tc>
+          <w:tcPr>
+            <w:tcW w:type="dxa" w:w="864"/>
+          </w:tcPr>
+          <w:p>
+            <w:r>
+              <w:rPr>
+                <w:sz w:val="16"/>
+              </w:rPr>
+              <w:t>0.63</w:t>
+            </w:r>
+          </w:p>
+        </w:tc>
+      </w:tr>
+      <w:tr>
+        <w:tc>
+          <w:tcPr>
+            <w:tcW w:type="dxa" w:w="720"/>
+          </w:tcPr>
+          <w:p>
+            <w:r>
+              <w:rPr>
+                <w:sz w:val="16"/>
+              </w:rPr>
+              <w:t>20</w:t>
+            </w:r>
+          </w:p>
+        </w:tc>
+        <w:tc>
+          <w:tcPr>
+            <w:tcW w:type="dxa" w:w="2016"/>
+          </w:tcPr>
+          <w:p>
+            <w:r>
+              <w:rPr>
+                <w:sz w:val="16"/>
+              </w:rPr>
+              <w:t>PolyU-1</w:t>
+            </w:r>
+          </w:p>
+        </w:tc>
+        <w:tc>
+          <w:tcPr>
+            <w:tcW w:type="dxa" w:w="864"/>
+          </w:tcPr>
+          <w:p>
+            <w:r>
+              <w:rPr>
+                <w:sz w:val="16"/>
+              </w:rPr>
+              <w:t>0.71</w:t>
+            </w:r>
+          </w:p>
+        </w:tc>
+      </w:tr>
+      <w:tr>
+        <w:tc>
+          <w:tcPr>
+            <w:tcW w:type="dxa" w:w="720"/>
+          </w:tcPr>
+          <w:p>
+            <w:r>
+              <w:rPr>
+                <w:sz w:val="16"/>
+              </w:rPr>
+              <w:t>21</w:t>
+            </w:r>
+          </w:p>
+        </w:tc>
+        <w:tc>
+          <w:tcPr>
+            <w:tcW w:type="dxa" w:w="2016"/>
+          </w:tcPr>
+          <w:p>
+            <w:r>
+              <w:rPr>
+                <w:sz w:val="16"/>
+              </w:rPr>
+              <w:t>OB-1A</w:t>
+            </w:r>
+          </w:p>
+        </w:tc>
+        <w:tc>
+          <w:tcPr>
+            <w:tcW w:type="dxa" w:w="864"/>
+          </w:tcPr>
+          <w:p>
+            <w:r>
+              <w:rPr>
+                <w:sz w:val="16"/>
+              </w:rPr>
+              <w:t>0.79</w:t>
+            </w:r>
+          </w:p>
+        </w:tc>
+      </w:tr>
+      <w:tr>
+        <w:tc>
+          <w:tcPr>
+            <w:tcW w:type="dxa" w:w="720"/>
+          </w:tcPr>
+          <w:p>
+            <w:r>
+              <w:rPr>
+                <w:sz w:val="16"/>
+              </w:rPr>
+              <w:t>22</w:t>
+            </w:r>
+          </w:p>
+        </w:tc>
+        <w:tc>
+          <w:tcPr>
+            <w:tcW w:type="dxa" w:w="2016"/>
+          </w:tcPr>
+          <w:p>
+            <w:r>
+              <w:rPr>
+                <w:sz w:val="16"/>
+              </w:rPr>
+              <w:t>IGG-01</w:t>
+            </w:r>
+          </w:p>
+        </w:tc>
+        <w:tc>
+          <w:tcPr>
+            <w:tcW w:type="dxa" w:w="864"/>
+          </w:tcPr>
+          <w:p>
+            <w:r>
+              <w:rPr>
+                <w:sz w:val="16"/>
+              </w:rPr>
+              <w:t>1.00</w:t>
+            </w:r>
+          </w:p>
+        </w:tc>
+      </w:tr>
+      <w:tr>
+        <w:tc>
+          <w:tcPr>
+            <w:tcW w:type="dxa" w:w="720"/>
+          </w:tcPr>
+          <w:p>
+            <w:r>
+              <w:rPr>
+                <w:sz w:val="16"/>
+              </w:rPr>
+              <w:t>23</w:t>
+            </w:r>
+          </w:p>
+        </w:tc>
+        <w:tc>
+          <w:tcPr>
+            <w:tcW w:type="dxa" w:w="2016"/>
+          </w:tcPr>
+          <w:p>
+            <w:r>
+              <w:rPr>
+                <w:sz w:val="16"/>
+              </w:rPr>
+              <w:t>NAO-1</w:t>
+            </w:r>
+          </w:p>
+        </w:tc>
+        <w:tc>
+          <w:tcPr>
+            <w:tcW w:type="dxa" w:w="864"/>
+          </w:tcPr>
+          <w:p>
+            <w:r>
+              <w:rPr>
+                <w:sz w:val="16"/>
+              </w:rPr>
+              <w:t>1.00</w:t>
+            </w:r>
+          </w:p>
+        </w:tc>
+      </w:tr>
+    </w:tbl>
+    <w:p>
+      <w:pPr>
         <w:spacing w:after="0"/>
         <w:ind w:firstLine="288"/>
         <w:jc w:val="both"/>
@@ -303,7 +1329,7 @@
         <w:rPr>
           <w:sz w:val="20"/>
         </w:rPr>
-        <w:t>The index runs over the 23 simulants with a measured cohesion. Each gets a score in [0, 1], where 0 is friendliest to plants and 1 is riskiest. The scores are not evenly spread: most simulants sit below about 0.5 and only a handful reach the risky end, so the ranking is about picking out the few problem soils rather than splitting a smooth gradient. At the friendly end are LSS-ISAC-1 (0.00), EAC-1A (0.00), and MLS-1 (0.02), with LHS-1 (0.07) close behind. At the risky end IGG-01 and NAO-1 reach 1.00, with OB-1A (0.79) and PolyU-1 (0.71) just below; NAO-1 carries the very high measured cohesion and was always going to land here.</w:t>
+        <w:t>The index runs over the 23 simulants with a measured cohesion, listed in Table I. Each gets a score in [0, 1], where 0 is friendliest to plants and 1 is riskiest. The scores are not evenly spread: most simulants sit below about 0.5 and only a handful reach the risky end, so the ranking is about picking out the few problem soils rather than splitting a smooth gradient. At the friendly end are LSS-ISAC-1 (0.00), EAC-1A (0.00), and MLS-1 (0.02), with LHS-1 (0.07) close behind. At the risky end IGG-01 and NAO-1 reach 1.00, with OB-1A (0.79) and PolyU-1 (0.71) just below; NAO-1 carries the very high measured cohesion and was always going to land here.</w:t>
       </w:r>
     </w:p>
     <w:p>

</xml_diff>

<commit_message>
docx: add the score figure under the table
</commit_message>
<xml_diff>
--- a/paper/icdm/icdm.docx
+++ b/paper/icdm/icdm.docx
@@ -1321,6 +1321,63 @@
     </w:tbl>
     <w:p>
       <w:pPr>
+        <w:jc w:val="center"/>
+      </w:pPr>
+      <w:r>
+        <w:drawing>
+          <wp:inline xmlns:a="http://schemas.openxmlformats.org/drawingml/2006/main" xmlns:pic="http://schemas.openxmlformats.org/drawingml/2006/picture">
+            <wp:extent cx="2743200" cy="1775012"/>
+            <wp:docPr id="1" name="Picture 1"/>
+            <wp:cNvGraphicFramePr>
+              <a:graphicFrameLocks noChangeAspect="1"/>
+            </wp:cNvGraphicFramePr>
+            <a:graphic>
+              <a:graphicData uri="http://schemas.openxmlformats.org/drawingml/2006/picture">
+                <pic:pic>
+                  <pic:nvPicPr>
+                    <pic:cNvPr id="0" name="fig_scores.png"/>
+                    <pic:cNvPicPr/>
+                  </pic:nvPicPr>
+                  <pic:blipFill>
+                    <a:blip r:embed="rId9"/>
+                    <a:stretch>
+                      <a:fillRect/>
+                    </a:stretch>
+                  </pic:blipFill>
+                  <pic:spPr>
+                    <a:xfrm>
+                      <a:off x="0" y="0"/>
+                      <a:ext cx="2743200" cy="1775012"/>
+                    </a:xfrm>
+                    <a:prstGeom prst="rect"/>
+                  </pic:spPr>
+                </pic:pic>
+              </a:graphicData>
+            </a:graphic>
+          </wp:inline>
+        </w:drawing>
+      </w:r>
+    </w:p>
+    <w:p>
+      <w:pPr>
+        <w:jc w:val="center"/>
+      </w:pPr>
+      <w:r>
+        <w:rPr>
+          <w:b/>
+          <w:sz w:val="16"/>
+        </w:rPr>
+        <w:t xml:space="preserve">Fig. 1.  </w:t>
+      </w:r>
+      <w:r>
+        <w:rPr>
+          <w:sz w:val="16"/>
+        </w:rPr>
+        <w:t>Distribution of screening scores across the 23 simulants. Most sit at the low, plant-friendly end, with only a few reaching the risky end.</w:t>
+      </w:r>
+    </w:p>
+    <w:p>
+      <w:pPr>
         <w:spacing w:after="0"/>
         <w:ind w:firstLine="288"/>
         <w:jc w:val="both"/>
@@ -1329,7 +1386,7 @@
         <w:rPr>
           <w:sz w:val="20"/>
         </w:rPr>
-        <w:t>The index runs over the 23 simulants with a measured cohesion, listed in Table I. Each gets a score in [0, 1], where 0 is friendliest to plants and 1 is riskiest. The scores are not evenly spread: most simulants sit below about 0.5 and only a handful reach the risky end, so the ranking is about picking out the few problem soils rather than splitting a smooth gradient. At the friendly end are LSS-ISAC-1 (0.00), EAC-1A (0.00), and MLS-1 (0.02), with LHS-1 (0.07) close behind. At the risky end IGG-01 and NAO-1 reach 1.00, with OB-1A (0.79) and PolyU-1 (0.71) just below; NAO-1 carries the very high measured cohesion and was always going to land here.</w:t>
+        <w:t>The index runs over the 23 simulants with a measured cohesion, listed in Table I. Each gets a score in [0, 1], where 0 is friendliest to plants and 1 is riskiest. The scores are not evenly spread (Fig. 1): most simulants sit below about 0.5 and only a handful reach the risky end, so the ranking is about picking out the few problem soils rather than splitting a smooth gradient. At the friendly end are LSS-ISAC-1 (0.00), EAC-1A (0.00), and MLS-1 (0.02), with LHS-1 (0.07) close behind. At the risky end IGG-01 and NAO-1 reach 1.00, with OB-1A (0.79) and PolyU-1 (0.71) just below; NAO-1 carries the very high measured cohesion and was always going to land here.</w:t>
       </w:r>
     </w:p>
     <w:p>

</xml_diff>

<commit_message>
rebuild the paper with the acknowledgment and availability note
</commit_message>
<xml_diff>
--- a/paper/icdm/icdm.docx
+++ b/paper/icdm/icdm.docx
@@ -1507,6 +1507,58 @@
       </w:r>
     </w:p>
     <w:p>
+      <w:pPr>
+        <w:spacing w:before="120" w:after="60"/>
+        <w:jc w:val="center"/>
+      </w:pPr>
+      <w:r>
+        <w:rPr>
+          <w:b/>
+          <w:sz w:val="20"/>
+        </w:rPr>
+        <w:t>VIII.  ACKNOWLEDGMENT</w:t>
+      </w:r>
+    </w:p>
+    <w:p>
+      <w:pPr>
+        <w:spacing w:after="0"/>
+        <w:ind w:firstLine="288"/>
+        <w:jc w:val="both"/>
+      </w:pPr>
+      <w:r>
+        <w:rPr>
+          <w:sz w:val="20"/>
+        </w:rPr>
+        <w:t>The author thanks Seo Ho Song for guidance, and the teams behind the Gasteiner database, PlanetGSD, and the OSD-670 study for making their measurements public.</w:t>
+      </w:r>
+    </w:p>
+    <w:p>
+      <w:pPr>
+        <w:spacing w:before="120" w:after="60"/>
+        <w:jc w:val="center"/>
+      </w:pPr>
+      <w:r>
+        <w:rPr>
+          <w:b/>
+          <w:sz w:val="20"/>
+        </w:rPr>
+        <w:t>IX.  DATA AND CODE AVAILABILITY</w:t>
+      </w:r>
+    </w:p>
+    <w:p>
+      <w:pPr>
+        <w:spacing w:after="0"/>
+        <w:ind w:firstLine="288"/>
+        <w:jc w:val="both"/>
+      </w:pPr>
+      <w:r>
+        <w:rPr>
+          <w:sz w:val="20"/>
+        </w:rPr>
+        <w:t>Every input used here is public and cited above. The code that cleans the data, builds the score, and runs the checks is available at github.com/ikonkim2027-Korea/regolith-crop-screening.</w:t>
+      </w:r>
+    </w:p>
+    <w:p>
       <w:r>
         <w:rPr>
           <w:b/>

</xml_diff>

<commit_message>
rebuild the paper with the email and fixed references
</commit_message>
<xml_diff>
--- a/paper/icdm/icdm.docx
+++ b/paper/icdm/icdm.docx
@@ -24,6 +24,8 @@
         <w:t>High School Student</w:t>
         <w:br/>
         <w:t>St. Mark's School</w:t>
+        <w:br/>
+        <w:t>ikonkim2027@gmail.com</w:t>
       </w:r>
     </w:p>
     <w:p>
@@ -1575,7 +1577,7 @@
         <w:rPr>
           <w:sz w:val="16"/>
         </w:rPr>
-        <w:t>[1] R. Russell et al., "Testing CI asteroid regolith simulant as a plant growth medium," Planetary Science Journal, vol. 3, no. 7, art. 155, 2022.</w:t>
+        <w:t>[1] S. J. Russell, S. K. Fieber-Beyer, and K. A. Yurkonis, "CI asteroid regolith as an in situ plant growth medium for space crop production," Planetary Science Journal, vol. 3, no. 7, art. 155, 2022, doi:10.3847/PSJ/ac74c9.</w:t>
       </w:r>
     </w:p>
     <w:p>
@@ -1586,7 +1588,7 @@
         <w:rPr>
           <w:sz w:val="16"/>
         </w:rPr>
-        <w:t>[2] L. Gasteiner, N. Murdoch, and A. D'Angelo, "An open database of lunar regolith and simulant mechanical properties," arXiv:2602.03829, 2026.</w:t>
+        <w:t>[2] L. Gasteiner, N. Murdoch, et al., "An open database of lunar regolith and simulants properties," arXiv:2602.03829, 2026.</w:t>
       </w:r>
     </w:p>
     <w:p>
@@ -1597,7 +1599,7 @@
         <w:rPr>
           <w:sz w:val="16"/>
         </w:rPr>
-        <w:t>[3] PlanetGSD 1.0: a global grain-size database for planetary surfaces, Earth System Science Data, 2026.</w:t>
+        <w:t>[3] A global dataset of grain-size distributions from Earth, the Moon, and Mars, Earth System Science Data, preprint essd-2026-206, 2026.</w:t>
       </w:r>
     </w:p>
     <w:p>
@@ -1630,7 +1632,7 @@
         <w:rPr>
           <w:sz w:val="16"/>
         </w:rPr>
-        <w:t>[6] L. G. Duri et al., "The potential of regolith simulants as agricultural substrates," Frontiers in Astronomy and Space Sciences, vol. 8, art. 747821, 2022.</w:t>
+        <w:t>[6] L. G. Duri et al., "The potential for lunar and Martian regolith simulants to sustain plant growth: a multidisciplinary overview," Frontiers in Astronomy and Space Sciences, vol. 8, art. 747821, 2022.</w:t>
       </w:r>
     </w:p>
     <w:p>
@@ -1641,7 +1643,7 @@
         <w:rPr>
           <w:sz w:val="16"/>
         </w:rPr>
-        <w:t>[7] J. Dotson et al., "Cohesion and bulk density relationships for compacted regolith," Icarus, vol. 411, art. 115943, 2024.</w:t>
+        <w:t>[7] B. Dotson et al., "Cohesion and shear strength of compacted lunar and Martian regolith simulants," Icarus, vol. 411, art. 115943, 2024.</w:t>
       </w:r>
     </w:p>
     <w:p>

</xml_diff>

<commit_message>
docx: match the IEEE CS margins and column gap, bump the title to 24pt
</commit_message>
<xml_diff>
--- a/paper/icdm/icdm.docx
+++ b/paper/icdm/icdm.docx
@@ -9,7 +9,7 @@
       <w:r>
         <w:rPr>
           <w:b/>
-          <w:sz w:val="36"/>
+          <w:sz w:val="48"/>
         </w:rPr>
         <w:t>From Soil Mechanics to Crop Stress: Screening Regolith Simulants for Plant Suitability from Public Soil Data</w:t>
       </w:r>
@@ -32,7 +32,7 @@
       <w:pPr>
         <w:sectPr>
           <w:pgSz w:w="12240" w:h="15840"/>
-          <w:pgMar w:top="1080" w:right="900" w:bottom="1440" w:left="900" w:header="720" w:footer="720" w:gutter="0"/>
+          <w:pgMar w:top="1440" w:right="1170" w:bottom="1620" w:left="1170" w:header="720" w:footer="720" w:gutter="0"/>
           <w:cols w:space="720"/>
           <w:docGrid w:linePitch="360"/>
         </w:sectPr>
@@ -1671,8 +1671,8 @@
     <w:sectPr>
       <w:type w:val="continuous"/>
       <w:pgSz w:w="12240" w:h="15840"/>
-      <w:pgMar w:top="1080" w:right="900" w:bottom="1440" w:left="900" w:header="720" w:footer="720" w:gutter="0"/>
-      <w:cols w:space="288" w:num="2"/>
+      <w:pgMar w:top="1440" w:right="1170" w:bottom="1620" w:left="1170" w:header="720" w:footer="720" w:gutter="0"/>
+      <w:cols w:space="450" w:num="2"/>
       <w:docGrid w:linePitch="360"/>
     </w:sectPr>
   </w:body>

</xml_diff>

<commit_message>
rebuild the paper with the crusting-screen reframe
</commit_message>
<xml_diff>
--- a/paper/icdm/icdm.docx
+++ b/paper/icdm/icdm.docx
@@ -55,7 +55,7 @@
           <w:i/>
           <w:sz w:val="18"/>
         </w:rPr>
-        <w:t>Growing crops on the Moon or Mars means growing them in regolith, and testing whether plants tolerate a given simulant takes a multi-week growth trial, so only a few of the many published simulants have been tested. This work asks whether public soil measurements alone can screen simulants for how hard they are on plants, before any trial. Three public datasets, engineering properties, grain size, and plant results, are joined into one table keyed by simulant. A random forest that tries to predict cohesion from the other properties fails under mission-grouped cross validation (R2 below zero); this negative result is reported because it reflects how noisy the pooled cohesion data is. In its place a screening score is built from measured cohesion and a small pH-to-stress calibration, and 23 simulants are ranked from friendliest to riskiest. The ranking agrees with the two simulants that have published growth results, and a jitter test shows the friendly and risky ends are stable while the middle is not. The result is a reproducible screen that flags likely problem soils from data that already exists.</w:t>
+        <w:t>Growing crops on the Moon or Mars means growing them in regolith, and testing whether plants tolerate a given simulant takes a multi-week growth trial, so only a few of the many published simulants have been tested. This work asks whether public soil measurements alone can screen simulants for how hard they are on plants, before any trial. Three public datasets, engineering properties, grain size, and plant results, are joined into one table keyed by simulant. A random forest that tries to predict cohesion from the other properties fails under mission-grouped cross validation (R2 below zero); this negative result is reported because it reflects how noisy the pooled cohesion data is. In its place a screening score is built from measured cohesion and a small pH-to-stress calibration, and 23 simulants are ranked from friendliest to riskiest. The ranking agrees with the two simulants that have published growth results, and a jitter test shows the friendly and risky ends are stable while the middle is not. The result is a reproducible screen for crusting risk, the physical failure mode that soil amendments do not fix, built from data that already exists.</w:t>
       </w:r>
     </w:p>
     <w:p>
@@ -1427,6 +1427,19 @@
         <w:rPr>
           <w:sz w:val="20"/>
         </w:rPr>
+        <w:t>Chasing more growth results would not sharpen this much. A recent systematic review of cultivation studies reports that unamended simulants nearly all grow plants poorly, held back mainly by their chemistry rather than their structure [10]. That is what makes a physical screen worth building: chemistry can be corrected with amendments, but the crusting risk this index measures is what remains after it is.</w:t>
+      </w:r>
+    </w:p>
+    <w:p>
+      <w:pPr>
+        <w:spacing w:after="0"/>
+        <w:ind w:firstLine="288"/>
+        <w:jc w:val="both"/>
+      </w:pPr>
+      <w:r>
+        <w:rPr>
+          <w:sz w:val="20"/>
+        </w:rPr>
         <w:t>To test stability, every cohesion value was jittered by up to 20 percent and the compaction ranking rebuilt 2000 times. The friendliest three simulants stayed in the friendly group in about 78 percent of runs and the riskiest three in about 67 percent, with a median Kendall tau of 0.95 against the original order. The order barely moves overall; where it moves is the middle, where several simulants sit within a few hundredths and swap places. So the two ends are solid and the middle band should not be read as an exact order. This test moves the compaction scores only, so it does not probe JSC-1A, the single row the chemistry term adjusts.</w:t>
       </w:r>
     </w:p>
@@ -1666,6 +1679,17 @@
           <w:sz w:val="16"/>
         </w:rPr>
         <w:t>[9] O. E. Gundersen and S. Kjensmo, "State of the art: reproducibility in artificial intelligence," in Proc. AAAI, 2018.</w:t>
+      </w:r>
+    </w:p>
+    <w:p>
+      <w:pPr>
+        <w:spacing w:after="0"/>
+      </w:pPr>
+      <w:r>
+        <w:rPr>
+          <w:sz w:val="16"/>
+        </w:rPr>
+        <w:t>[10] A. Kamouh, D. Chami, A. A. Abdelmouneim, R. Khadra, and S. De Pascale, "A systematic review of plant cultivation and growth in extraterrestrial regolith simulants," Life Sciences in Space Research, 2026, doi:10.1016/j.lssr.2026.04.005.</w:t>
       </w:r>
     </w:p>
     <w:sectPr>

</xml_diff>

<commit_message>
leave acknowledgment and availability unnumbered, the way IEEE does
</commit_message>
<xml_diff>
--- a/paper/icdm/icdm.docx
+++ b/paper/icdm/icdm.docx
@@ -1531,7 +1531,7 @@
           <w:b/>
           <w:sz w:val="20"/>
         </w:rPr>
-        <w:t>VIII.  ACKNOWLEDGMENT</w:t>
+        <w:t>ACKNOWLEDGMENT</w:t>
       </w:r>
     </w:p>
     <w:p>
@@ -1557,7 +1557,7 @@
           <w:b/>
           <w:sz w:val="20"/>
         </w:rPr>
-        <w:t>IX.  DATA AND CODE AVAILABILITY</w:t>
+        <w:t>DATA AND CODE AVAILABILITY</w:t>
       </w:r>
     </w:p>
     <w:p>

</xml_diff>

<commit_message>
make the repo link a real clickable hyperlink in both formats
</commit_message>
<xml_diff>
--- a/paper/icdm/icdm.docx
+++ b/paper/icdm/icdm.docx
@@ -1570,7 +1570,24 @@
         <w:rPr>
           <w:sz w:val="20"/>
         </w:rPr>
-        <w:t>Every input here is public and cited above; nothing was measured for this study. The pipeline is version-controlled and tested, and every number, table, and figure in this paper regenerates from a single script, including the model that failed and the checks that flag the weak spots. The full history is at github.com/ikonkim2027-Korea/regolith-crop-screening.</w:t>
+        <w:t xml:space="preserve">Every input here is public and cited above; nothing was measured for this study. The pipeline is version-controlled and tested, and every number, table, and figure in this paper regenerates from a single script, including the model that failed and the checks that flag the weak spots. The full history is at </w:t>
+      </w:r>
+      <w:hyperlink r:id="rId10">
+        <w:r>
+          <w:rPr>
+            <w:rFonts w:ascii="Times New Roman" w:hAnsi="Times New Roman"/>
+            <w:color w:val="0563C1"/>
+            <w:u w:val="single"/>
+            <w:sz w:val="20"/>
+          </w:rPr>
+          <w:t>github.com/ikonkim2027-Korea/regolith-crop-screening</w:t>
+        </w:r>
+      </w:hyperlink>
+      <w:r>
+        <w:rPr>
+          <w:sz w:val="20"/>
+        </w:rPr>
+        <w:t>.</w:t>
       </w:r>
     </w:p>
     <w:p>

</xml_diff>